<commit_message>
Add Declaration and Definitions; fix heading colours; update title; add LaTeX build
- Add 01b_declaration.md (Author s declaration with signature lines)
- Add 01c_definitions.md (14 key terms: bbox, crown, CVAT, DeepForest, GeoJSON,
  GeoTIFF, GSD, instance segmentation, mAP, SAM 2, tiled inference, WBF, WGS-84,
  YOLOv8-seg)
- Fix heading colour: explicitly set black (000000) and strip themeColor in
  make_styles.py so Word does not override with blue theme colour
- Update title to official name: Development of a Deep Learning Model for
  Automated Tree Recognition and Green Space Mapping in Urban Environments
- Update build_latex.py: include declaration + definitions in LaTeX driver,
  add glob patterns for 01b/01c files, install tectonic support

Co-Authored-By: Claude Sonnet 4.6 <noreply@anthropic.com>
</commit_message>
<xml_diff>
--- a/thesis/reference.docx
+++ b/thesis/reference.docx
@@ -406,6 +406,7 @@
       <w:rFonts w:ascii="Times New Roman" w:hAnsi="Times New Roman" w:eastAsia="Times New Roman" w:cs="Times New Roman"/>
       <w:b w:val="0"/>
       <w:i w:val="0"/>
+      <w:color w:val="000000"/>
       <w:sz w:val="24"/>
     </w:rPr>
   </w:style>
@@ -473,7 +474,7 @@
       <w:b/>
       <w:bCs/>
       <w:i w:val="0"/>
-      <w:color w:val="365F91" w:themeColor="accent1" w:themeShade="BF"/>
+      <w:color w:val="000000"/>
       <w:sz w:val="32"/>
       <w:szCs w:val="28"/>
     </w:rPr>
@@ -498,7 +499,7 @@
       <w:b/>
       <w:bCs/>
       <w:i w:val="0"/>
-      <w:color w:val="4F81BD" w:themeColor="accent1"/>
+      <w:color w:val="000000"/>
       <w:sz w:val="28"/>
       <w:szCs w:val="26"/>
     </w:rPr>
@@ -523,7 +524,7 @@
       <w:b/>
       <w:bCs/>
       <w:i w:val="0"/>
-      <w:color w:val="4F81BD" w:themeColor="accent1"/>
+      <w:color w:val="000000"/>
       <w:sz w:val="26"/>
     </w:rPr>
   </w:style>
@@ -549,7 +550,7 @@
       <w:bCs/>
       <w:i/>
       <w:iCs/>
-      <w:color w:val="4F81BD" w:themeColor="accent1"/>
+      <w:color w:val="000000"/>
       <w:sz w:val="24"/>
     </w:rPr>
   </w:style>
@@ -767,7 +768,7 @@
       <w:rFonts w:asciiTheme="majorHAnsi" w:eastAsiaTheme="majorEastAsia" w:hAnsiTheme="majorHAnsi" w:cstheme="majorBidi" w:ascii="Times New Roman" w:hAnsi="Times New Roman" w:eastAsia="Times New Roman" w:cs="Times New Roman"/>
       <w:b/>
       <w:i w:val="0"/>
-      <w:color w:val="17365D" w:themeColor="text2" w:themeShade="BF"/>
+      <w:color w:val="000000"/>
       <w:spacing w:val="5"/>
       <w:kern w:val="28"/>
       <w:sz w:val="40"/>

</xml_diff>